<commit_message>
Atualiza o template genérico, renomeia o layout umovme para classic e adiciona como contribuir
- Template genérico com rodapé neutro (Empresa - slogan); tema do exemplo espelha o rodapé
- Layout padrão dos compiladores passa a se chamar "classic" (comentários e AGENTS.md)
- README: seção "Como contribuir"; AGENTS.md: seção "Contribuições"
- Exemplo: contribuições aceitas e decisões atualizadas

Co-Authored-By: Claude Sonnet 5.5 <noreply@anthropic.com>
</commit_message>
<xml_diff>
--- a/template-generico-projeto-doc.docx
+++ b/template-generico-projeto-doc.docx
@@ -1274,7 +1274,7 @@
               <w:szCs w:val="20"/>
               <w:rtl w:val="0"/>
             </w:rPr>
-            <w:t xml:space="preserve">Wildtech </w:t>
+            <w:t xml:space="preserve">Empresa </w:t>
           </w:r>
           <w:r>
             <w:rPr>
@@ -1283,7 +1283,7 @@
               <w:szCs w:val="20"/>
               <w:rtl w:val="0"/>
             </w:rPr>
-            <w:t xml:space="preserve">- Start wild, keep wild</w:t>
+            <w:t xml:space="preserve">- slogan</w:t>
           </w:r>
           <w:r>
             <w:rPr>
@@ -1297,19 +1297,15 @@
             <w:jc w:val="right"/>
             <w:rPr/>
           </w:pPr>
-          <w:hyperlink r:id="rId1">
-            <w:r>
-              <w:rPr>
-                <w:rFonts w:ascii="Open Sans" w:cs="Open Sans" w:eastAsia="Open Sans" w:hAnsi="Open Sans"/>
-                <w:color w:val="000099"/>
-                <w:sz w:val="20"/>
-                <w:szCs w:val="20"/>
-                <w:u w:val="single"/>
-                <w:rtl w:val="0"/>
-              </w:rPr>
-              <w:t xml:space="preserve">www.wildtech.com.br</w:t>
-            </w:r>
-          </w:hyperlink>
+          <w:r>
+            <w:rPr>
+              <w:rFonts w:ascii="Open Sans" w:cs="Open Sans" w:eastAsia="Open Sans" w:hAnsi="Open Sans"/>
+              <w:sz w:val="20"/>
+              <w:szCs w:val="20"/>
+              <w:rtl w:val="0"/>
+            </w:rPr>
+            <w:t xml:space="preserve">https endereçoempresa</w:t>
+          </w:r>
           <w:r>
             <w:rPr>
               <w:rtl w:val="0"/>

</xml_diff>